<commit_message>
Add product/security/ops topics; rename Cash Management to Kas & Vault
Expand training materi/slides with additional topics discovered from
core/enterprise codebase: Deposito, Kliring, Teller/Counter, QRIS/VA,
Host-to-Host/REST API, Corporate Banking, CIF, Biller/Remittance, Dana
Haji, batch EOD/BOD, backup/DR, and maker-checker/security/audit.

Also rename the "Cash Management" module to "Kas & Vault (Teller/ATM)"
across diagrams, materi, and slides to avoid confusion with the
industry term "Cash Management System" (corporate CIF web portal),
which is a different thing from this internal physical-cash module.
Regenerate all diagram PNGs and rebuild dist/docx+pptx accordingly.
</commit_message>
<xml_diff>
--- a/dist/materi_training_ibankcore.docx
+++ b/dist/materi_training_ibankcore.docx
@@ -103,7 +103,7 @@
         <w:spacing w:after="160" w:line="300"/>
       </w:pPr>
       <w:r>
-        <w:t xml:space="preserve">Sesi ini bertujuan memberikan pemahaman menyeluruh (overview) mengenai sistem core banking IBANKCORE, khususnya modul Accounting, Funding, dan Treasury (Cash Management), serta bagaimana ketiga modul tersebut berinteraksi satu sama lain maupun dengan aplikasi/sistem di sekitarnya (channel, sistem kliring, regulator, dan platform integrasi).</w:t>
+        <w:t xml:space="preserve">Sesi ini bertujuan memberikan pemahaman menyeluruh (overview) mengenai sistem core banking IBANKCORE, khususnya modul Accounting, Funding, dan Treasury (Kas &amp; Vault), serta bagaimana ketiga modul tersebut berinteraksi satu sama lain maupun dengan aplikasi/sistem di sekitarnya (channel, sistem kliring, regulator, dan platform integrasi).</w:t>
       </w:r>
     </w:p>
     <w:p>
@@ -133,7 +133,7 @@
         <w:spacing w:after="80"/>
       </w:pPr>
       <w:r>
-        <w:t xml:space="preserve">Arsitektur modul IBANKCORE secara keseluruhan (Funding, Financing, Accounting, Cash Management, Remittance, Internal Account, Customer, Enterprise).</w:t>
+        <w:t xml:space="preserve">Arsitektur modul IBANKCORE secara keseluruhan (Funding, Financing, Accounting, Kas &amp; Vault, Remittance, Internal Account, Customer, Enterprise).</w:t>
       </w:r>
     </w:p>
     <w:p>
@@ -172,7 +172,7 @@
         <w:spacing w:after="80"/>
       </w:pPr>
       <w:r>
-        <w:t xml:space="preserve">Konsep Treasury / Cash Management, termasuk abstraksi CASH_POINT (teller, vault, ATM, sundry).</w:t>
+        <w:t xml:space="preserve">Konsep Treasury / Kas &amp; Vault (Teller/ATM), termasuk abstraksi CASH_POINT (teller, vault, ATM, sundry).</w:t>
       </w:r>
     </w:p>
     <w:p>
@@ -212,6 +212,45 @@
       </w:pPr>
       <w:r>
         <w:t xml:space="preserve">Contoh proses bisnis end-to-end: Setor Tunai dan Pindah Buku.</w:t>
+      </w:r>
+    </w:p>
+    <w:p>
+      <w:pPr>
+        <w:pStyle w:val="ListParagraph"/>
+        <w:numPr>
+          <w:ilvl w:val="0"/>
+          <w:numId w:val="2"/>
+        </w:numPr>
+        <w:spacing w:after="80"/>
+      </w:pPr>
+      <w:r>
+        <w:t xml:space="preserve">Produk &amp; layanan tambahan: Deposito, Kliring, Teller &amp; Layanan Counter, QRIS &amp; Virtual Account, Host-to-Host &amp; REST API, Corporate Banking, Manajemen Rekening &amp; Nasabah (CIF), Biller &amp; Remittance, integrasi SAP/GL eksternal, dan produk Dana Haji.</w:t>
+      </w:r>
+    </w:p>
+    <w:p>
+      <w:pPr>
+        <w:pStyle w:val="ListParagraph"/>
+        <w:numPr>
+          <w:ilvl w:val="0"/>
+          <w:numId w:val="2"/>
+        </w:numPr>
+        <w:spacing w:after="80"/>
+      </w:pPr>
+      <w:r>
+        <w:t xml:space="preserve">Operasional batch &amp; kontinuitas layanan: End-of-Day/Begin-of-Day (EOD/BOD) cabang, serta backup &amp; disaster recovery.</w:t>
+      </w:r>
+    </w:p>
+    <w:p>
+      <w:pPr>
+        <w:pStyle w:val="ListParagraph"/>
+        <w:numPr>
+          <w:ilvl w:val="0"/>
+          <w:numId w:val="2"/>
+        </w:numPr>
+        <w:spacing w:after="80"/>
+      </w:pPr>
+      <w:r>
+        <w:t xml:space="preserve">Keamanan, otorisasi, dan audit lanjutan: mekanisme maker-checker (OtorEntri), user security &amp; access control, session/block management, dan verifikasi biometrik.</w:t>
       </w:r>
     </w:p>
     <w:p>
@@ -508,7 +547,7 @@
                 <w:sz w:val="20"/>
                 <w:szCs w:val="20"/>
               </w:rPr>
-              <w:t xml:space="preserve">Cash Management</w:t>
+              <w:t xml:space="preserve">Kas &amp; Vault (Teller/ATM)</w:t>
             </w:r>
           </w:p>
         </w:tc>
@@ -712,6 +751,116 @@
     </w:p>
     <w:p>
       <w:pPr>
+        <w:pStyle w:val="Heading2"/>
+        <w:spacing w:after="120" w:before="260"/>
+      </w:pPr>
+      <w:r>
+        <w:t xml:space="preserve">2.4 Aplikasi Core vs Enterprise</w:t>
+      </w:r>
+    </w:p>
+    <w:p>
+      <w:pPr>
+        <w:spacing w:after="160" w:line="300"/>
+      </w:pPr>
+      <w:r>
+        <w:t xml:space="preserve">Secara implementasi, IBANKCORE terdiri dari dua aplikasi terpisah namun saling terkait: </w:t>
+      </w:r>
+      <w:r>
+        <w:rPr>
+          <w:b/>
+          <w:bCs/>
+        </w:rPr>
+        <w:t xml:space="preserve">core</w:t>
+      </w:r>
+      <w:r>
+        <w:t xml:space="preserve"> dan </w:t>
+      </w:r>
+      <w:r>
+        <w:rPr>
+          <w:b/>
+          <w:bCs/>
+        </w:rPr>
+        <w:t xml:space="preserve">enterprise</w:t>
+      </w:r>
+      <w:r>
+        <w:t xml:space="preserve">.</w:t>
+      </w:r>
+    </w:p>
+    <w:p>
+      <w:pPr>
+        <w:pStyle w:val="ListParagraph"/>
+        <w:numPr>
+          <w:ilvl w:val="0"/>
+          <w:numId w:val="2"/>
+        </w:numPr>
+        <w:spacing w:after="80"/>
+      </w:pPr>
+      <w:r>
+        <w:rPr>
+          <w:b/>
+          <w:bCs/>
+        </w:rPr>
+        <w:t xml:space="preserve">Aplikasi Core</w:t>
+      </w:r>
+      <w:r>
+        <w:t xml:space="preserve"> — mesin transaksi &amp; produk perbankan itu sendiri: logika akun, transaksi, jurnal, serta seluruh produk (Deposito, Tabungan, Kliring, Teller, Corporate) dan integrasi kanal (QRIS, host-to-host, REST API). Aplikasi ini dideploy per-instansi/bank, ditandai dengan konfigurasi lingkungan terpisah seperti training, UAT, dan production.</w:t>
+      </w:r>
+    </w:p>
+    <w:p>
+      <w:pPr>
+        <w:pStyle w:val="ListParagraph"/>
+        <w:numPr>
+          <w:ilvl w:val="0"/>
+          <w:numId w:val="2"/>
+        </w:numPr>
+        <w:spacing w:after="80"/>
+      </w:pPr>
+      <w:r>
+        <w:rPr>
+          <w:b/>
+          <w:bCs/>
+        </w:rPr>
+        <w:t xml:space="preserve">Aplikasi Enterprise</w:t>
+      </w:r>
+      <w:r>
+        <w:t xml:space="preserve"> — modul platform/administratif di atas core: manajemen user &amp; cabang, keamanan &amp; hak akses, mekanisme otorisasi (maker-checker), proses batch operasional (EOD/BOD), backup/disaster recovery, serta monitoring sesi user.</w:t>
+      </w:r>
+    </w:p>
+    <w:p>
+      <w:pPr>
+        <w:pStyle w:val="ListParagraph"/>
+        <w:numPr>
+          <w:ilvl w:val="0"/>
+          <w:numId w:val="2"/>
+        </w:numPr>
+        <w:spacing w:after="80"/>
+      </w:pPr>
+      <w:r>
+        <w:t xml:space="preserve">Kedua aplikasi berbagi prinsip dan pola arsitektur yang sama (lapisan data, struktur transaksi), namun </w:t>
+      </w:r>
+      <w:r>
+        <w:rPr>
+          <w:b/>
+          <w:bCs/>
+        </w:rPr>
+        <w:t xml:space="preserve">core</w:t>
+      </w:r>
+      <w:r>
+        <w:t xml:space="preserve"> berfokus pada domain bisnis/produk sedangkan </w:t>
+      </w:r>
+      <w:r>
+        <w:rPr>
+          <w:b/>
+          <w:bCs/>
+        </w:rPr>
+        <w:t xml:space="preserve">enterprise</w:t>
+      </w:r>
+      <w:r>
+        <w:t xml:space="preserve"> berfokus pada domain administrasi, keamanan, dan operasional platform.</w:t>
+      </w:r>
+    </w:p>
+    <w:p>
+      <w:pPr>
         <w:pStyle w:val="Heading1"/>
         <w:spacing w:after="160" w:before="360"/>
       </w:pPr>
@@ -972,7 +1121,84 @@
         <w:spacing w:after="160" w:line="300"/>
       </w:pPr>
       <w:r>
-        <w:t xml:space="preserve">Setiap transaksi pada rekening Funding (misalnya Setor Tunai) akan memicu pencatatan pada modul Accounting (DR/CR) dan, bila melibatkan kas fisik, berinteraksi dengan modul Cash Management melalui abstraksi CASH_POINT.</w:t>
+        <w:t xml:space="preserve">Setiap transaksi pada rekening Funding (misalnya Setor Tunai) akan memicu pencatatan pada modul Accounting (DR/CR) dan, bila melibatkan kas fisik, berinteraksi dengan modul Kas &amp; Vault melalui abstraksi CASH_POINT.</w:t>
+      </w:r>
+    </w:p>
+    <w:p>
+      <w:pPr>
+        <w:pStyle w:val="Heading2"/>
+        <w:spacing w:after="120" w:before="260"/>
+      </w:pPr>
+      <w:r>
+        <w:t xml:space="preserve">4.3 Produk Deposito</w:t>
+      </w:r>
+    </w:p>
+    <w:p>
+      <w:pPr>
+        <w:spacing w:after="160" w:line="300"/>
+      </w:pPr>
+      <w:r>
+        <w:t xml:space="preserve">Deposito adalah salah satu produk Funding dengan karakteristik jangka waktu dan perhitungan bagi hasil/bunga tersendiri, mencakup beberapa proses khusus.</w:t>
+      </w:r>
+    </w:p>
+    <w:p>
+      <w:pPr>
+        <w:pStyle w:val="ListParagraph"/>
+        <w:numPr>
+          <w:ilvl w:val="0"/>
+          <w:numId w:val="2"/>
+        </w:numPr>
+        <w:spacing w:after="80"/>
+      </w:pPr>
+      <w:r>
+        <w:rPr>
+          <w:b/>
+          <w:bCs/>
+        </w:rPr>
+        <w:t xml:space="preserve">Perhitungan bunga/bagi hasil</w:t>
+      </w:r>
+      <w:r>
+        <w:t xml:space="preserve"> — dihitung berdasarkan nominal, jangka waktu, dan nisbah/suku bunga yang berlaku pada saat pembukaan atau perpanjangan deposito.</w:t>
+      </w:r>
+    </w:p>
+    <w:p>
+      <w:pPr>
+        <w:pStyle w:val="ListParagraph"/>
+        <w:numPr>
+          <w:ilvl w:val="0"/>
+          <w:numId w:val="2"/>
+        </w:numPr>
+        <w:spacing w:after="80"/>
+      </w:pPr>
+      <w:r>
+        <w:rPr>
+          <w:b/>
+          <w:bCs/>
+        </w:rPr>
+        <w:t xml:space="preserve">Pencairan awal (premature withdrawal)</w:t>
+      </w:r>
+      <w:r>
+        <w:t xml:space="preserve"> — pencairan sebelum jatuh tempo, umumnya dikenakan penalti atau penyesuaian bagi hasil sesuai kebijakan bank.</w:t>
+      </w:r>
+    </w:p>
+    <w:p>
+      <w:pPr>
+        <w:pStyle w:val="ListParagraph"/>
+        <w:numPr>
+          <w:ilvl w:val="0"/>
+          <w:numId w:val="2"/>
+        </w:numPr>
+        <w:spacing w:after="80"/>
+      </w:pPr>
+      <w:r>
+        <w:rPr>
+          <w:b/>
+          <w:bCs/>
+        </w:rPr>
+        <w:t xml:space="preserve">Perubahan nisbah</w:t>
+      </w:r>
+      <w:r>
+        <w:t xml:space="preserve"> — penyesuaian porsi bagi hasil (untuk produk syariah) yang dapat berlaku pada perpanjangan otomatis (roll-over) deposito.</w:t>
       </w:r>
     </w:p>
     <w:p>
@@ -981,15 +1207,33 @@
         <w:spacing w:after="160" w:before="360"/>
       </w:pPr>
       <w:r>
-        <w:t xml:space="preserve">5. Modul Treasury / Cash Management</w:t>
-      </w:r>
-    </w:p>
-    <w:p>
-      <w:pPr>
-        <w:spacing w:after="160" w:line="300"/>
-      </w:pPr>
-      <w:r>
-        <w:t xml:space="preserve">Modul Cash Management mengelola pergerakan kas fisik dan likuiditas bank, termasuk kas teller, vault (khazanah), ATM, dan rekening sundry.</w:t>
+        <w:t xml:space="preserve">5. Modul Treasury / Kas &amp; Vault (Teller/ATM)</w:t>
+      </w:r>
+    </w:p>
+    <w:p>
+      <w:pPr>
+        <w:spacing w:after="160" w:line="300"/>
+      </w:pPr>
+      <w:r>
+        <w:t xml:space="preserve">Modul Kas &amp; Vault mengelola pergerakan kas fisik dan likuiditas bank, termasuk kas teller, vault (khazanah), ATM, dan rekening sundry.</w:t>
+      </w:r>
+    </w:p>
+    <w:p>
+      <w:pPr>
+        <w:spacing w:after="160" w:line="300"/>
+      </w:pPr>
+      <w:r>
+        <w:t xml:space="preserve">&gt; </w:t>
+      </w:r>
+      <w:r>
+        <w:rPr>
+          <w:b/>
+          <w:bCs/>
+        </w:rPr>
+        <w:t xml:space="preserve">Catatan istilah</w:t>
+      </w:r>
+      <w:r>
+        <w:t xml:space="preserve">: modul ini berbeda dengan istilah industri "Cash Management System (CMS)", yang umumnya merujuk pada portal/aplikasi web bagi nasabah korporat (CIF) untuk kebutuhan pembayaran massal, koleksi, dan monitoring likuiditas multi-rekening. Modul yang dibahas di sini secara spesifik menangani manajemen kas fisik internal cabang (laci teller, vault, ATM, sundry), bukan kanal digital nasabah korporat.</w:t>
       </w:r>
     </w:p>
     <w:p>
@@ -1116,7 +1360,63 @@
           <w:sz w:val="18"/>
           <w:szCs w:val="18"/>
         </w:rPr>
-        <w:t xml:space="preserve">Gambar 5.1 — Integrasi Cash Management, Treasury &amp; Remittance dengan sistem sekitar</w:t>
+        <w:t xml:space="preserve">Gambar 5.1 — Integrasi Kas &amp; Vault, Treasury &amp; Remittance dengan sistem sekitar</w:t>
+      </w:r>
+    </w:p>
+    <w:p>
+      <w:pPr>
+        <w:pStyle w:val="Heading2"/>
+        <w:spacing w:after="120" w:before="260"/>
+      </w:pPr>
+      <w:r>
+        <w:t xml:space="preserve">5.3 Modul Teller &amp; Layanan Counter</w:t>
+      </w:r>
+    </w:p>
+    <w:p>
+      <w:pPr>
+        <w:spacing w:after="160" w:line="300"/>
+      </w:pPr>
+      <w:r>
+        <w:t xml:space="preserve">Modul Teller/Layanan Counter merepresentasikan alur transaksi front office di cabang — titik interaksi langsung antara nasabah dan sistem melalui CASH_POINT laci teller.</w:t>
+      </w:r>
+    </w:p>
+    <w:p>
+      <w:pPr>
+        <w:pStyle w:val="ListParagraph"/>
+        <w:numPr>
+          <w:ilvl w:val="0"/>
+          <w:numId w:val="2"/>
+        </w:numPr>
+        <w:spacing w:after="80"/>
+      </w:pPr>
+      <w:r>
+        <w:t xml:space="preserve">Mendukung ragam transaksi counter (setor, tarik, pemindahbukuan, layanan lain) dalam satu alur kerja teller yang konsisten.</w:t>
+      </w:r>
+    </w:p>
+    <w:p>
+      <w:pPr>
+        <w:pStyle w:val="ListParagraph"/>
+        <w:numPr>
+          <w:ilvl w:val="0"/>
+          <w:numId w:val="2"/>
+        </w:numPr>
+        <w:spacing w:after="80"/>
+      </w:pPr>
+      <w:r>
+        <w:t xml:space="preserve">Setiap transaksi teller tervalidasi terhadap saldo kas fisik pada CASH_POINT terkait sebelum dicatat ke modul Accounting.</w:t>
+      </w:r>
+    </w:p>
+    <w:p>
+      <w:pPr>
+        <w:pStyle w:val="ListParagraph"/>
+        <w:numPr>
+          <w:ilvl w:val="0"/>
+          <w:numId w:val="2"/>
+        </w:numPr>
+        <w:spacing w:after="80"/>
+      </w:pPr>
+      <w:r>
+        <w:t xml:space="preserve">Menjadi titik awal (entry point) paling umum bagi sebagian besar contoh proses bisnis (lihat Bagian 8).</w:t>
       </w:r>
     </w:p>
     <w:p>
@@ -1580,6 +1880,106 @@
     </w:p>
     <w:p>
       <w:pPr>
+        <w:pStyle w:val="Heading2"/>
+        <w:spacing w:after="120" w:before="260"/>
+      </w:pPr>
+      <w:r>
+        <w:t xml:space="preserve">7.4 Modul Kliring</w:t>
+      </w:r>
+    </w:p>
+    <w:p>
+      <w:pPr>
+        <w:spacing w:after="160" w:line="300"/>
+      </w:pPr>
+      <w:r>
+        <w:t xml:space="preserve">Selain kliring sebagai sistem pembayaran antar bank (SKN, lihat 7.2), IBANKCORE memiliki modul transaksi kliring tersendiri yang menangani pencatatan dan pemrosesan warkat/instruksi kliring nasabah sebelum diteruskan ke sistem kliring nasional.</w:t>
+      </w:r>
+    </w:p>
+    <w:p>
+      <w:pPr>
+        <w:pStyle w:val="Heading2"/>
+        <w:spacing w:after="120" w:before="260"/>
+      </w:pPr>
+      <w:r>
+        <w:t xml:space="preserve">7.5 QRIS &amp; Virtual Account</w:t>
+      </w:r>
+    </w:p>
+    <w:p>
+      <w:pPr>
+        <w:pStyle w:val="ListParagraph"/>
+        <w:numPr>
+          <w:ilvl w:val="0"/>
+          <w:numId w:val="2"/>
+        </w:numPr>
+        <w:spacing w:after="80"/>
+      </w:pPr>
+      <w:r>
+        <w:rPr>
+          <w:b/>
+          <w:bCs/>
+        </w:rPr>
+        <w:t xml:space="preserve">QRIS</w:t>
+      </w:r>
+      <w:r>
+        <w:t xml:space="preserve"> — kanal pembayaran berbasis kode QR standar nasional; transaksi QRIS masuk melalui integrasi channel pihak ketiga dan diselesaikan (settlement) ke rekening tujuan melalui proses tersendiri.</w:t>
+      </w:r>
+    </w:p>
+    <w:p>
+      <w:pPr>
+        <w:pStyle w:val="ListParagraph"/>
+        <w:numPr>
+          <w:ilvl w:val="0"/>
+          <w:numId w:val="2"/>
+        </w:numPr>
+        <w:spacing w:after="80"/>
+      </w:pPr>
+      <w:r>
+        <w:rPr>
+          <w:b/>
+          <w:bCs/>
+        </w:rPr>
+        <w:t xml:space="preserve">Virtual Account (VA)</w:t>
+      </w:r>
+      <w:r>
+        <w:t xml:space="preserve"> — nomor rekening virtual yang dipetakan ke rekening nasabah/tujuan sebenarnya, umumnya dipakai untuk penagihan (billing) atau penerimaan pembayaran; pencocokan (matching) pembayaran VA dilakukan secara terjadwal (batch).</w:t>
+      </w:r>
+    </w:p>
+    <w:p>
+      <w:pPr>
+        <w:pStyle w:val="Heading2"/>
+        <w:spacing w:after="120" w:before="260"/>
+      </w:pPr>
+      <w:r>
+        <w:t xml:space="preserve">7.6 Host-to-Host &amp; REST API</w:t>
+      </w:r>
+    </w:p>
+    <w:p>
+      <w:pPr>
+        <w:spacing w:after="160" w:line="300"/>
+      </w:pPr>
+      <w:r>
+        <w:t xml:space="preserve">Selain kanal konvensional, IBANKCORE menyediakan integrasi host-to-host serta REST API bagi sistem eksternal (mis. aplikasi mitra, agregator pembayaran) untuk memicu transaksi maupun menarik data secara terprogram, mengikuti kontrak/format pesan yang telah disepakati (request/response berbasis JSON).</w:t>
+      </w:r>
+    </w:p>
+    <w:p>
+      <w:pPr>
+        <w:pStyle w:val="Heading2"/>
+        <w:spacing w:after="120" w:before="260"/>
+      </w:pPr>
+      <w:r>
+        <w:t xml:space="preserve">7.7 Integrasi Akuntansi Eksternal (SAP)</w:t>
+      </w:r>
+    </w:p>
+    <w:p>
+      <w:pPr>
+        <w:spacing w:after="160" w:line="300"/>
+      </w:pPr>
+      <w:r>
+        <w:t xml:space="preserve">Untuk kebutuhan konsolidasi keuangan pada level korporasi/holding, IBANKCORE dapat mengirimkan posting akuntansi secara batch ke sistem akuntansi eksternal seperti SAP, sebagai pelengkap pencatatan GL internal pada modul Accounting.</w:t>
+      </w:r>
+    </w:p>
+    <w:p>
+      <w:pPr>
         <w:pStyle w:val="Heading1"/>
         <w:spacing w:after="160" w:before="360"/>
       </w:pPr>
@@ -1680,7 +2080,7 @@
         <w:spacing w:after="160" w:line="300"/>
       </w:pPr>
       <w:r>
-        <w:t xml:space="preserve">Pindah Buku (transfer antar rekening dalam bank yang sama) mengikuti pola serupa dengan Setor Tunai, namun tanpa melibatkan kas fisik — mutasi DR terjadi pada rekening sumber dan mutasi CR pada rekening tujuan secara bersamaan (atomik), tanpa keterlibatan modul Cash Management.</w:t>
+        <w:t xml:space="preserve">Pindah Buku (transfer antar rekening dalam bank yang sama) mengikuti pola serupa dengan Setor Tunai, namun tanpa melibatkan kas fisik — mutasi DR terjadi pada rekening sumber dan mutasi CR pada rekening tujuan secara bersamaan (atomik), tanpa keterlibatan modul Kas &amp; Vault.</w:t>
       </w:r>
     </w:p>
     <w:p>
@@ -1689,15 +2089,115 @@
         <w:spacing w:after="160" w:before="360"/>
       </w:pPr>
       <w:r>
-        <w:t xml:space="preserve">9. Konteks Regulasi &amp; Produk Syariah</w:t>
-      </w:r>
-    </w:p>
-    <w:p>
-      <w:pPr>
-        <w:spacing w:after="160" w:line="300"/>
-      </w:pPr>
-      <w:r>
-        <w:t xml:space="preserve">Sebagian produk pada modul Financing mengikuti prinsip syariah dan mengacu pada PSAK 109, mencakup skema seperti Murabahah (jual-beli dengan margin), Ijarah (sewa), dan Kafalah (penjaminan). Perlakuan akuntansi untuk skema-skema ini memiliki kekhususan dibandingkan produk konvensional, dan tetap harus konsisten dengan prinsip double-entry pada modul Accounting.</w:t>
+        <w:t xml:space="preserve">9. Produk &amp; Layanan Tambahan</w:t>
+      </w:r>
+    </w:p>
+    <w:p>
+      <w:pPr>
+        <w:spacing w:after="160" w:line="300"/>
+      </w:pPr>
+      <w:r>
+        <w:t xml:space="preserve">Selain modul-modul inti (Bagian 3-8), IBANKCORE mendukung sejumlah produk dan layanan tambahan yang memperluas cakupan bisnis bank.</w:t>
+      </w:r>
+    </w:p>
+    <w:p>
+      <w:pPr>
+        <w:pStyle w:val="Heading2"/>
+        <w:spacing w:after="120" w:before="260"/>
+      </w:pPr>
+      <w:r>
+        <w:t xml:space="preserve">9.1 Corporate Banking</w:t>
+      </w:r>
+    </w:p>
+    <w:p>
+      <w:pPr>
+        <w:spacing w:after="160" w:line="300"/>
+      </w:pPr>
+      <w:r>
+        <w:t xml:space="preserve">Layanan khusus untuk nasabah korporat — mencakup parameter dan fitur yang berbeda dari nasabah ritel, seperti otorisasi transaksi bertingkat sesuai struktur kewenangan perusahaan nasabah.</w:t>
+      </w:r>
+    </w:p>
+    <w:p>
+      <w:pPr>
+        <w:pStyle w:val="Heading2"/>
+        <w:spacing w:after="120" w:before="260"/>
+      </w:pPr>
+      <w:r>
+        <w:t xml:space="preserve">9.2 Manajemen Rekening &amp; Nasabah (CIF)</w:t>
+      </w:r>
+    </w:p>
+    <w:p>
+      <w:pPr>
+        <w:spacing w:after="160" w:line="300"/>
+      </w:pPr>
+      <w:r>
+        <w:t xml:space="preserve">Modul ini menangani siklus hidup data nasabah dan rekening — mulai dari pembukaan Customer Information File (CIF), pembukaan rekening, pemeliharaan data, hingga penutupan rekening — dan menjadi rujukan identitas/profil yang divalidasi oleh modul Funding maupun Financing saat transaksi terjadi.</w:t>
+      </w:r>
+    </w:p>
+    <w:p>
+      <w:pPr>
+        <w:pStyle w:val="Heading2"/>
+        <w:spacing w:after="120" w:before="260"/>
+      </w:pPr>
+      <w:r>
+        <w:t xml:space="preserve">9.3 Biller &amp; Remittance</w:t>
+      </w:r>
+    </w:p>
+    <w:p>
+      <w:pPr>
+        <w:pStyle w:val="ListParagraph"/>
+        <w:numPr>
+          <w:ilvl w:val="0"/>
+          <w:numId w:val="2"/>
+        </w:numPr>
+        <w:spacing w:after="80"/>
+      </w:pPr>
+      <w:r>
+        <w:rPr>
+          <w:b/>
+          <w:bCs/>
+        </w:rPr>
+        <w:t xml:space="preserve">Biller</w:t>
+      </w:r>
+      <w:r>
+        <w:t xml:space="preserve"> — integrasi pembayaran tagihan pihak ketiga (listrik, telekomunikasi, dan sejenisnya) melalui antarmuka biller tersendiri.</w:t>
+      </w:r>
+    </w:p>
+    <w:p>
+      <w:pPr>
+        <w:pStyle w:val="ListParagraph"/>
+        <w:numPr>
+          <w:ilvl w:val="0"/>
+          <w:numId w:val="2"/>
+        </w:numPr>
+        <w:spacing w:after="80"/>
+      </w:pPr>
+      <w:r>
+        <w:rPr>
+          <w:b/>
+          <w:bCs/>
+        </w:rPr>
+        <w:t xml:space="preserve">Remittance</w:t>
+      </w:r>
+      <w:r>
+        <w:t xml:space="preserve"> — pengiriman/penerimaan dana lintas bank maupun lintas negara, melengkapi kanal kliring/RTGS/BI-FAST yang telah dibahas pada Bagian 7.</w:t>
+      </w:r>
+    </w:p>
+    <w:p>
+      <w:pPr>
+        <w:pStyle w:val="Heading2"/>
+        <w:spacing w:after="120" w:before="260"/>
+      </w:pPr>
+      <w:r>
+        <w:t xml:space="preserve">9.4 Dana Haji</w:t>
+      </w:r>
+    </w:p>
+    <w:p>
+      <w:pPr>
+        <w:spacing w:after="160" w:line="300"/>
+      </w:pPr>
+      <w:r>
+        <w:t xml:space="preserve">Produk pembiayaan/simpanan khusus untuk kebutuhan dana haji, dengan aturan dan skema pencatatan tersendiri yang tetap mengikuti prinsip double-entry pada modul Accounting.</w:t>
       </w:r>
     </w:p>
     <w:p>
@@ -1706,20 +2206,218 @@
         <w:spacing w:after="160" w:before="360"/>
       </w:pPr>
       <w:r>
-        <w:t xml:space="preserve">10. Ringkasan</w:t>
-      </w:r>
-    </w:p>
-    <w:p>
-      <w:pPr>
-        <w:pStyle w:val="ListParagraph"/>
-        <w:numPr>
-          <w:ilvl w:val="0"/>
-          <w:numId w:val="2"/>
-        </w:numPr>
-        <w:spacing w:after="80"/>
-      </w:pPr>
-      <w:r>
-        <w:t xml:space="preserve">IBANKCORE adalah sistem core banking multi-modul yang berbagi lapisan data dan pola integrasi yang konsisten.</w:t>
+        <w:t xml:space="preserve">10. Operasional Batch &amp; Kontinuitas Layanan</w:t>
+      </w:r>
+    </w:p>
+    <w:p>
+      <w:pPr>
+        <w:pStyle w:val="Heading2"/>
+        <w:spacing w:after="120" w:before="260"/>
+      </w:pPr>
+      <w:r>
+        <w:t xml:space="preserve">10.1 Batch Process &amp; EOD/BOD</w:t>
+      </w:r>
+    </w:p>
+    <w:p>
+      <w:pPr>
+        <w:spacing w:after="160" w:line="300"/>
+      </w:pPr>
+      <w:r>
+        <w:t xml:space="preserve">Operasional cabang mengikuti siklus harian yang dikelola melalui proses batch:</w:t>
+      </w:r>
+    </w:p>
+    <w:p>
+      <w:pPr>
+        <w:pStyle w:val="ListParagraph"/>
+        <w:numPr>
+          <w:ilvl w:val="0"/>
+          <w:numId w:val="2"/>
+        </w:numPr>
+        <w:spacing w:after="80"/>
+      </w:pPr>
+      <w:r>
+        <w:rPr>
+          <w:b/>
+          <w:bCs/>
+        </w:rPr>
+        <w:t xml:space="preserve">End-of-Day (EOD)</w:t>
+      </w:r>
+      <w:r>
+        <w:t xml:space="preserve"> — rangkaian proses tutup hari yang memastikan seluruh transaksi hari tersebut telah tercatat, saldo direkonsiliasi, dan cabang dapat ditutup secara sistem.</w:t>
+      </w:r>
+    </w:p>
+    <w:p>
+      <w:pPr>
+        <w:pStyle w:val="ListParagraph"/>
+        <w:numPr>
+          <w:ilvl w:val="0"/>
+          <w:numId w:val="2"/>
+        </w:numPr>
+        <w:spacing w:after="80"/>
+      </w:pPr>
+      <w:r>
+        <w:rPr>
+          <w:b/>
+          <w:bCs/>
+        </w:rPr>
+        <w:t xml:space="preserve">Begin-of-Day (BOD)</w:t>
+      </w:r>
+      <w:r>
+        <w:t xml:space="preserve"> — proses pembukaan hari kerja baru, termasuk persiapan cabang (branch open) sebelum transaksi hari itu dapat dimulai.</w:t>
+      </w:r>
+    </w:p>
+    <w:p>
+      <w:pPr>
+        <w:pStyle w:val="ListParagraph"/>
+        <w:numPr>
+          <w:ilvl w:val="0"/>
+          <w:numId w:val="2"/>
+        </w:numPr>
+        <w:spacing w:after="80"/>
+      </w:pPr>
+      <w:r>
+        <w:t xml:space="preserve">Proses ini memastikan konsistensi data antar hari operasional dan menjadi prasyarat sebelum laporan harian maupun pelaporan regulator dapat disusun.</w:t>
+      </w:r>
+    </w:p>
+    <w:p>
+      <w:pPr>
+        <w:pStyle w:val="Heading2"/>
+        <w:spacing w:after="120" w:before="260"/>
+      </w:pPr>
+      <w:r>
+        <w:t xml:space="preserve">10.2 Backup &amp; Disaster Recovery</w:t>
+      </w:r>
+    </w:p>
+    <w:p>
+      <w:pPr>
+        <w:spacing w:after="160" w:line="300"/>
+      </w:pPr>
+      <w:r>
+        <w:t xml:space="preserve">Untuk menjaga kontinuitas layanan, IBANKCORE mendukung mekanisme backup database secara berjenjang (mis. backup penuh maupun incremental) serta prosedur disaster recovery, sebagai bagian dari kepatuhan terhadap kebutuhan ketahanan operasional (business continuity) perbankan.</w:t>
+      </w:r>
+    </w:p>
+    <w:p>
+      <w:pPr>
+        <w:pStyle w:val="Heading1"/>
+        <w:spacing w:after="160" w:before="360"/>
+      </w:pPr>
+      <w:r>
+        <w:t xml:space="preserve">11. Keamanan, Otorisasi &amp; Audit Lanjutan</w:t>
+      </w:r>
+    </w:p>
+    <w:p>
+      <w:pPr>
+        <w:spacing w:after="160" w:line="300"/>
+      </w:pPr>
+      <w:r>
+        <w:t xml:space="preserve">Selain hak akses dasar dan audit trail yang telah dibahas pada Bagian 6, IBANKCORE menerapkan beberapa mekanisme keamanan dan kontrol tambahan yang penting untuk dipahami.</w:t>
+      </w:r>
+    </w:p>
+    <w:p>
+      <w:pPr>
+        <w:pStyle w:val="Heading2"/>
+        <w:spacing w:after="120" w:before="260"/>
+      </w:pPr>
+      <w:r>
+        <w:t xml:space="preserve">11.1 Maker-Checker / Otorisasi</w:t>
+      </w:r>
+    </w:p>
+    <w:p>
+      <w:pPr>
+        <w:spacing w:after="160" w:line="300"/>
+      </w:pPr>
+      <w:r>
+        <w:t xml:space="preserve">Prinsip maker-checker (dual control) diimplementasikan melalui mekanisme otorisasi entri (OtorEntri) — transaksi atau perubahan data tertentu dicatat dalam status "menunggu otorisasi" dan baru berlaku efektif setelah disetujui oleh user lain dengan kewenangan yang sesuai. Riwayat otorisasi (termasuk siapa yang mengajukan dan siapa yang menyetujui/menolak) tersimpan sebagai jejak audit tersendiri, terpisah dari data transaksi utama.</w:t>
+      </w:r>
+    </w:p>
+    <w:p>
+      <w:pPr>
+        <w:pStyle w:val="Heading2"/>
+        <w:spacing w:after="120" w:before="260"/>
+      </w:pPr>
+      <w:r>
+        <w:t xml:space="preserve">11.2 User Security &amp; Access Control</w:t>
+      </w:r>
+    </w:p>
+    <w:p>
+      <w:pPr>
+        <w:spacing w:after="160" w:line="300"/>
+      </w:pPr>
+      <w:r>
+        <w:t xml:space="preserve">Selain Role-Based Access Control dasar (lihat 6.3), sistem menyediakan validasi keamanan data user, pencatatan aktivitas user (activity log), serta laporan hak akses (daftar menu/hak akses per user maupun per grup) yang mendukung kebutuhan audit periodik terhadap kesesuaian hak akses dengan peran pekerjaan.</w:t>
+      </w:r>
+    </w:p>
+    <w:p>
+      <w:pPr>
+        <w:pStyle w:val="Heading2"/>
+        <w:spacing w:after="120" w:before="260"/>
+      </w:pPr>
+      <w:r>
+        <w:t xml:space="preserve">11.3 Session &amp; Block Management</w:t>
+      </w:r>
+    </w:p>
+    <w:p>
+      <w:pPr>
+        <w:spacing w:after="160" w:line="300"/>
+      </w:pPr>
+      <w:r>
+        <w:t xml:space="preserve">Sistem memantau dan mengelola sesi login user, termasuk kedaluwarsa sesi (session expiry) dan pemblokiran otomatis user setelah kondisi tertentu (mis. percobaan login gagal berulang), sebagai kontrol keamanan tambahan terhadap akses tidak sah.</w:t>
+      </w:r>
+    </w:p>
+    <w:p>
+      <w:pPr>
+        <w:pStyle w:val="Heading2"/>
+        <w:spacing w:after="120" w:before="260"/>
+      </w:pPr>
+      <w:r>
+        <w:t xml:space="preserve">11.4 Verifikasi Biometrik</w:t>
+      </w:r>
+    </w:p>
+    <w:p>
+      <w:pPr>
+        <w:spacing w:after="160" w:line="300"/>
+      </w:pPr>
+      <w:r>
+        <w:t xml:space="preserve">Untuk transaksi atau proses yang memerlukan tingkat keyakinan identitas lebih tinggi, IBANKCORE mendukung verifikasi biometrik nasabah sebagai lapisan otentikasi tambahan di luar PIN/password konvensional.</w:t>
+      </w:r>
+    </w:p>
+    <w:p>
+      <w:pPr>
+        <w:pStyle w:val="Heading1"/>
+        <w:spacing w:after="160" w:before="360"/>
+      </w:pPr>
+      <w:r>
+        <w:t xml:space="preserve">12. Konteks Regulasi &amp; Produk Syariah</w:t>
+      </w:r>
+    </w:p>
+    <w:p>
+      <w:pPr>
+        <w:spacing w:after="160" w:line="300"/>
+      </w:pPr>
+      <w:r>
+        <w:t xml:space="preserve">Sebagian produk pada modul Financing mengikuti prinsip syariah dan mengacu pada PSAK 109, mencakup skema seperti Murabahah (jual-beli dengan margin), Ijarah (sewa), dan Kafalah (penjaminan). Perlakuan akuntansi untuk skema-skema ini memiliki kekhususan dibandingkan produk konvensional, dan tetap harus konsisten dengan prinsip double-entry pada modul Accounting.</w:t>
+      </w:r>
+    </w:p>
+    <w:p>
+      <w:pPr>
+        <w:pStyle w:val="Heading1"/>
+        <w:spacing w:after="160" w:before="360"/>
+      </w:pPr>
+      <w:r>
+        <w:t xml:space="preserve">13. Ringkasan</w:t>
+      </w:r>
+    </w:p>
+    <w:p>
+      <w:pPr>
+        <w:pStyle w:val="ListParagraph"/>
+        <w:numPr>
+          <w:ilvl w:val="0"/>
+          <w:numId w:val="2"/>
+        </w:numPr>
+        <w:spacing w:after="80"/>
+      </w:pPr>
+      <w:r>
+        <w:t xml:space="preserve">IBANKCORE adalah sistem core banking multi-modul yang berbagi lapisan data dan pola integrasi yang konsisten, terdiri dari dua aplikasi utama: core (mesin transaksi/produk) dan enterprise (platform, keamanan, operasional).</w:t>
       </w:r>
     </w:p>
     <w:p>
@@ -1745,7 +2443,7 @@
         <w:spacing w:after="80"/>
       </w:pPr>
       <w:r>
-        <w:t xml:space="preserve">Modul Funding dan Cash Management/Treasury saling terkait erat dalam setiap transaksi yang melibatkan dana maupun kas fisik.</w:t>
+        <w:t xml:space="preserve">Modul Funding dan Kas &amp; Vault/Treasury saling terkait erat dalam setiap transaksi yang melibatkan dana maupun kas fisik, termasuk produk khusus seperti Deposito.</w:t>
       </w:r>
     </w:p>
     <w:p>
@@ -1771,7 +2469,46 @@
         <w:spacing w:after="80"/>
       </w:pPr>
       <w:r>
-        <w:t xml:space="preserve">Interaksi dengan sistem sekitar (Kafka, SKN/RTGS/BI-FAST, regulator) menjadi bagian penting dari arsitektur end-to-end.</w:t>
+        <w:t xml:space="preserve">Interaksi dengan sistem sekitar (Kafka, SKN/RTGS/BI-FAST, QRIS, host-to-host/REST API, regulator) menjadi bagian penting dari arsitektur end-to-end.</w:t>
+      </w:r>
+    </w:p>
+    <w:p>
+      <w:pPr>
+        <w:pStyle w:val="ListParagraph"/>
+        <w:numPr>
+          <w:ilvl w:val="0"/>
+          <w:numId w:val="2"/>
+        </w:numPr>
+        <w:spacing w:after="80"/>
+      </w:pPr>
+      <w:r>
+        <w:t xml:space="preserve">Produk &amp; layanan tambahan (Corporate Banking, Biller &amp; Remittance, Dana Haji, dsb.) memperluas cakupan bisnis di luar produk simpanan/pembiayaan dasar.</w:t>
+      </w:r>
+    </w:p>
+    <w:p>
+      <w:pPr>
+        <w:pStyle w:val="ListParagraph"/>
+        <w:numPr>
+          <w:ilvl w:val="0"/>
+          <w:numId w:val="2"/>
+        </w:numPr>
+        <w:spacing w:after="80"/>
+      </w:pPr>
+      <w:r>
+        <w:t xml:space="preserve">Operasional batch (EOD/BOD) dan backup/disaster recovery menjaga konsistensi data dan kontinuitas layanan dari hari ke hari.</w:t>
+      </w:r>
+    </w:p>
+    <w:p>
+      <w:pPr>
+        <w:pStyle w:val="ListParagraph"/>
+        <w:numPr>
+          <w:ilvl w:val="0"/>
+          <w:numId w:val="2"/>
+        </w:numPr>
+        <w:spacing w:after="80"/>
+      </w:pPr>
+      <w:r>
+        <w:t xml:space="preserve">Mekanisme maker-checker (otorisasi), user security, session/block management, dan verifikasi biometrik menjadi lapisan kontrol keamanan yang penting dipahami baik oleh audiens teknis maupun bisnis/audit.</w:t>
       </w:r>
     </w:p>
     <w:p>
@@ -1833,6 +2570,32 @@
       </w:pPr>
       <w:r>
         <w:t xml:space="preserve">Bagaimana pengelolaan hak akses/limit otorisasi saat ini dijalankan di masing-masing cabang/departemen?</w:t>
+      </w:r>
+    </w:p>
+    <w:p>
+      <w:pPr>
+        <w:pStyle w:val="ListParagraph"/>
+        <w:numPr>
+          <w:ilvl w:val="0"/>
+          <w:numId w:val="2"/>
+        </w:numPr>
+        <w:spacing w:after="80"/>
+      </w:pPr>
+      <w:r>
+        <w:t xml:space="preserve">Bagaimana mekanisme maker-checker (otorisasi) saat ini diterapkan untuk transaksi bernilai besar atau berisiko tinggi?</w:t>
+      </w:r>
+    </w:p>
+    <w:p>
+      <w:pPr>
+        <w:pStyle w:val="ListParagraph"/>
+        <w:numPr>
+          <w:ilvl w:val="0"/>
+          <w:numId w:val="2"/>
+        </w:numPr>
+        <w:spacing w:after="80"/>
+      </w:pPr>
+      <w:r>
+        <w:t xml:space="preserve">Seberapa sering proses EOD/BOD dan backup/disaster recovery diuji atau mengalami kendala di lapangan?</w:t>
       </w:r>
     </w:p>
     <w:sectPr>

</xml_diff>